<commit_message>
feat: v1 — full pipeline, delete jobs, logo
Backend:
- Fix asyncpg event-loop reuse in Celery (NullPool for worker engine)
- Fix atomic progress updates via jsonb_set (eliminate race condition)
- UniProt: per-accession fetch replaces broken batch search
- g:Profiler: fix gene extraction from intersections (no_evidences=False)
- HPA: two-step search_download → ENSG JSON (fix 404s)
- SignalP: classify Sec/SPI, GPI-anchored, Unconventional, Other
- SASP: include gene/protein names in details
- DELETE /jobs/{id}: clean up MinIO objects before DB delete

Frontend:
- Jobs page: delete button per job, confirm dialog, bulk delete, count summary
- jobStore: add deleteJob with optimistic update
- Navbar: display Secretome Profiler logo
- EnrichmentPanel: external DB links, gene count in modal subtitle
- ProteinListModal: headerExtra and emptyFallback props
- SignalpPanel: 4-category pie chart + filter buttons
</commit_message>
<xml_diff>
--- a/Secretome profiler_prompt.docx
+++ b/Secretome profiler_prompt.docx
@@ -7130,7 +7130,7 @@
       </w:pPr>
       <w:r>
         <w:pict w14:anchorId="45C2EAEA">
-          <v:rect id="_x0000_i1045" style="width:0;height:1.5pt" o:hralign="center" o:hrstd="t" o:hr="t" fillcolor="#a0a0a0" stroked="f"/>
+          <v:rect id="_x0000_i1025" style="width:0;height:1.5pt" o:hralign="center" o:hrstd="t" o:hr="t" fillcolor="#a0a0a0" stroked="f"/>
         </w:pict>
       </w:r>
     </w:p>
@@ -7140,12 +7140,14 @@
         <w:rPr>
           <w:b/>
           <w:bCs/>
+          <w:color w:val="EE0000"/>
         </w:rPr>
       </w:pPr>
       <w:r>
         <w:rPr>
           <w:b/>
           <w:bCs/>
+          <w:color w:val="EE0000"/>
         </w:rPr>
         <w:t>How to use this in Cursor</w:t>
       </w:r>
@@ -7153,120 +7155,1100 @@
     <w:p>
       <w:pPr>
         <w:bidi w:val="0"/>
-      </w:pPr>
-      <w:r>
+        <w:rPr>
+          <w:color w:val="EE0000"/>
+        </w:rPr>
+      </w:pPr>
+      <w:r>
+        <w:rPr>
+          <w:color w:val="EE0000"/>
+        </w:rPr>
         <w:t>A few practical instructions for working in Cursor with this prompt:</w:t>
       </w:r>
     </w:p>
     <w:p>
       <w:pPr>
         <w:bidi w:val="0"/>
-      </w:pPr>
-      <w:r>
+        <w:rPr>
+          <w:color w:val="EE0000"/>
+        </w:rPr>
+      </w:pPr>
+      <w:r>
+        <w:rPr>
+          <w:color w:val="EE0000"/>
+        </w:rPr>
         <w:t xml:space="preserve">Open Cursor, create a new empty folder called </w:t>
       </w:r>
       <w:proofErr w:type="spellStart"/>
       <w:r>
+        <w:rPr>
+          <w:color w:val="EE0000"/>
+        </w:rPr>
         <w:t>secretome</w:t>
       </w:r>
       <w:proofErr w:type="spellEnd"/>
       <w:r>
+        <w:rPr>
+          <w:color w:val="EE0000"/>
+        </w:rPr>
         <w:t>-profiler, open it as your workspace. Open the Claude Code panel in the sidebar. Paste the entire prompt above. Let it run without interrupting — it will create files one by one.</w:t>
       </w:r>
     </w:p>
     <w:p>
       <w:pPr>
         <w:bidi w:val="0"/>
-      </w:pPr>
-      <w:r>
+        <w:rPr>
+          <w:color w:val="EE0000"/>
+        </w:rPr>
+      </w:pPr>
+      <w:r>
+        <w:rPr>
+          <w:color w:val="EE0000"/>
+        </w:rPr>
         <w:t>When it finishes Phase 1 and asks for confirmation, type: Run docker compose up --build and show me the output. Fix any errors before continuing.</w:t>
       </w:r>
     </w:p>
     <w:p>
       <w:pPr>
         <w:bidi w:val="0"/>
-      </w:pPr>
-      <w:r>
+        <w:rPr>
+          <w:color w:val="EE0000"/>
+        </w:rPr>
+      </w:pPr>
+      <w:r>
+        <w:rPr>
+          <w:color w:val="EE0000"/>
+        </w:rPr>
         <w:t xml:space="preserve">When the backend is confirmed healthy, type: Proceed to </w:t>
       </w:r>
       <w:proofErr w:type="gramStart"/>
       <w:r>
+        <w:rPr>
+          <w:color w:val="EE0000"/>
+        </w:rPr>
         <w:t>frontend</w:t>
       </w:r>
       <w:proofErr w:type="gramEnd"/>
       <w:r>
+        <w:rPr>
+          <w:color w:val="EE0000"/>
+        </w:rPr>
         <w:t xml:space="preserve"> Phase 2. Start with types/</w:t>
       </w:r>
       <w:proofErr w:type="spellStart"/>
       <w:r>
+        <w:rPr>
+          <w:color w:val="EE0000"/>
+        </w:rPr>
         <w:t>index.ts</w:t>
       </w:r>
       <w:proofErr w:type="spellEnd"/>
       <w:r>
+        <w:rPr>
+          <w:color w:val="EE0000"/>
+        </w:rPr>
         <w:t xml:space="preserve"> and </w:t>
       </w:r>
       <w:proofErr w:type="spellStart"/>
       <w:r>
+        <w:rPr>
+          <w:color w:val="EE0000"/>
+        </w:rPr>
         <w:t>api</w:t>
       </w:r>
       <w:proofErr w:type="spellEnd"/>
       <w:r>
+        <w:rPr>
+          <w:color w:val="EE0000"/>
+        </w:rPr>
         <w:t>/</w:t>
       </w:r>
       <w:proofErr w:type="spellStart"/>
       <w:r>
+        <w:rPr>
+          <w:color w:val="EE0000"/>
+        </w:rPr>
         <w:t>client.ts</w:t>
       </w:r>
       <w:proofErr w:type="spellEnd"/>
       <w:r>
+        <w:rPr>
+          <w:color w:val="EE0000"/>
+        </w:rPr>
         <w:t>.</w:t>
       </w:r>
     </w:p>
     <w:p>
       <w:pPr>
         <w:bidi w:val="0"/>
-      </w:pPr>
-      <w:r>
+        <w:rPr>
+          <w:color w:val="EE0000"/>
+        </w:rPr>
+      </w:pPr>
+      <w:r>
+        <w:rPr>
+          <w:color w:val="EE0000"/>
+        </w:rPr>
         <w:t>If Claude gets stuck or makes an error on any step, type: Stop. Fix only this error: [paste the error]. Do not change anything else. — this prevents it from going off-track and rewriting things that already work.</w:t>
       </w:r>
     </w:p>
     <w:p>
       <w:pPr>
         <w:bidi w:val="0"/>
+        <w:rPr>
+          <w:color w:val="EE0000"/>
+        </w:rPr>
       </w:pPr>
       <w:r>
         <w:rPr>
           <w:b/>
           <w:bCs/>
+          <w:color w:val="EE0000"/>
         </w:rPr>
         <w:t>GitHub setup</w:t>
       </w:r>
       <w:r>
+        <w:rPr>
+          <w:color w:val="EE0000"/>
+        </w:rPr>
         <w:t xml:space="preserve"> (do this on Day 1 before writing any code): Go to github.com, create a new private repository called </w:t>
       </w:r>
       <w:proofErr w:type="spellStart"/>
       <w:r>
+        <w:rPr>
+          <w:color w:val="EE0000"/>
+        </w:rPr>
         <w:t>secretome</w:t>
       </w:r>
       <w:proofErr w:type="spellEnd"/>
       <w:r>
+        <w:rPr>
+          <w:color w:val="EE0000"/>
+        </w:rPr>
         <w:t xml:space="preserve">-profiler. Then in Cursor's terminal: git </w:t>
       </w:r>
       <w:proofErr w:type="spellStart"/>
       <w:r>
+        <w:rPr>
+          <w:color w:val="EE0000"/>
+        </w:rPr>
         <w:t>init</w:t>
       </w:r>
       <w:proofErr w:type="spellEnd"/>
       <w:r>
+        <w:rPr>
+          <w:color w:val="EE0000"/>
+        </w:rPr>
         <w:t xml:space="preserve">, git remote add origin YOUR_REPO_URL, git </w:t>
       </w:r>
       <w:proofErr w:type="gramStart"/>
       <w:r>
+        <w:rPr>
+          <w:color w:val="EE0000"/>
+        </w:rPr>
         <w:t>add .</w:t>
       </w:r>
       <w:proofErr w:type="gramEnd"/>
       <w:r>
+        <w:rPr>
+          <w:color w:val="EE0000"/>
+        </w:rPr>
         <w:t>, git commit -m "initial scaffold", git push -u origin main. After that, commit and push at the end of each working session. This is your safety net.</w:t>
+      </w:r>
+    </w:p>
+    <w:p>
+      <w:pPr>
+        <w:bidi w:val="0"/>
+        <w:rPr>
+          <w:color w:val="EE0000"/>
+        </w:rPr>
+      </w:pPr>
+      <w:r>
+        <w:rPr>
+          <w:color w:val="EE0000"/>
+        </w:rPr>
+        <w:br w:type="page"/>
+      </w:r>
+    </w:p>
+    <w:p>
+      <w:r>
+        <w:lastRenderedPageBreak/>
+        <w:t xml:space="preserve">What does the app do? </w:t>
+      </w:r>
+      <w:r>
+        <w:t xml:space="preserve">This app — </w:t>
+      </w:r>
+      <w:proofErr w:type="spellStart"/>
+      <w:r>
+        <w:rPr>
+          <w:b/>
+          <w:bCs/>
+        </w:rPr>
+        <w:t>SecretomeProfiler</w:t>
+      </w:r>
+      <w:proofErr w:type="spellEnd"/>
+      <w:r>
+        <w:t xml:space="preserve"> — is a research tool that answers one core scientific question:</w:t>
+      </w:r>
+    </w:p>
+    <w:p>
+      <w:pPr>
+        <w:bidi w:val="0"/>
+      </w:pPr>
+      <w:r>
+        <w:rPr>
+          <w:i/>
+          <w:iCs/>
+        </w:rPr>
+        <w:t>"If I take the proteins secreted by a specific cell type and inject them therapeutically, what would they actually do in the body — and is that beneficial or harmful?"</w:t>
+      </w:r>
+    </w:p>
+    <w:p>
+      <w:pPr>
+        <w:bidi w:val="0"/>
+      </w:pPr>
+      <w:r>
+        <w:pict w14:anchorId="2A1F7F28">
+          <v:rect id="_x0000_i1026" style="width:0;height:1.5pt" o:hralign="center" o:hrstd="t" o:hr="t" fillcolor="#a0a0a0" stroked="f"/>
+        </w:pict>
+      </w:r>
+    </w:p>
+    <w:p>
+      <w:pPr>
+        <w:bidi w:val="0"/>
+        <w:rPr>
+          <w:b/>
+          <w:bCs/>
+        </w:rPr>
+      </w:pPr>
+      <w:r>
+        <w:rPr>
+          <w:b/>
+          <w:bCs/>
+        </w:rPr>
+        <w:t>The biological problem it solves</w:t>
+      </w:r>
+    </w:p>
+    <w:p>
+      <w:pPr>
+        <w:bidi w:val="0"/>
+      </w:pPr>
+      <w:r>
+        <w:t xml:space="preserve">When researchers consider </w:t>
+      </w:r>
+      <w:r>
+        <w:rPr>
+          <w:b/>
+          <w:bCs/>
+        </w:rPr>
+        <w:t>cell-based therapies</w:t>
+      </w:r>
+      <w:r>
+        <w:t xml:space="preserve"> (injecting stem cells, immune cells, or engineered cells into a patient), much of the therapeutic effect doesn't come from the cells themselves — it comes from the </w:t>
+      </w:r>
+      <w:r>
+        <w:rPr>
+          <w:b/>
+          <w:bCs/>
+        </w:rPr>
+        <w:t>proteins those cells secrete</w:t>
+      </w:r>
+      <w:r>
+        <w:t xml:space="preserve"> into the surrounding tissue. This collection of secreted proteins is called the </w:t>
+      </w:r>
+      <w:proofErr w:type="spellStart"/>
+      <w:r>
+        <w:rPr>
+          <w:b/>
+          <w:bCs/>
+        </w:rPr>
+        <w:t>secretome</w:t>
+      </w:r>
+      <w:proofErr w:type="spellEnd"/>
+      <w:r>
+        <w:t>.</w:t>
+      </w:r>
+    </w:p>
+    <w:p>
+      <w:pPr>
+        <w:bidi w:val="0"/>
+      </w:pPr>
+      <w:r>
+        <w:t xml:space="preserve">The problem is that a single cell type can secrete </w:t>
+      </w:r>
+      <w:r>
+        <w:rPr>
+          <w:b/>
+          <w:bCs/>
+        </w:rPr>
+        <w:t>hundreds of proteins simultaneously</w:t>
+      </w:r>
+      <w:r>
+        <w:t xml:space="preserve">, and understanding what that mixture does collectively is enormously complex. Right now, researchers either analyze proteins one by one (slow, expensive, misses interactions) or use generic pathway tools not designed for therapeutic </w:t>
+      </w:r>
+      <w:proofErr w:type="spellStart"/>
+      <w:r>
+        <w:t>secretome</w:t>
+      </w:r>
+      <w:proofErr w:type="spellEnd"/>
+      <w:r>
+        <w:t xml:space="preserve"> interpretation.</w:t>
+      </w:r>
+    </w:p>
+    <w:p>
+      <w:pPr>
+        <w:bidi w:val="0"/>
+      </w:pPr>
+      <w:proofErr w:type="spellStart"/>
+      <w:r>
+        <w:t>SecretomeProfiler</w:t>
+      </w:r>
+      <w:proofErr w:type="spellEnd"/>
+      <w:r>
+        <w:t xml:space="preserve"> solves this by treating the </w:t>
+      </w:r>
+      <w:proofErr w:type="spellStart"/>
+      <w:r>
+        <w:t>secretome</w:t>
+      </w:r>
+      <w:proofErr w:type="spellEnd"/>
+      <w:r>
+        <w:t xml:space="preserve"> as a </w:t>
+      </w:r>
+      <w:r>
+        <w:rPr>
+          <w:b/>
+          <w:bCs/>
+        </w:rPr>
+        <w:t>system</w:t>
+      </w:r>
+      <w:r>
+        <w:t xml:space="preserve"> rather than a list.</w:t>
+      </w:r>
+    </w:p>
+    <w:p>
+      <w:pPr>
+        <w:bidi w:val="0"/>
+      </w:pPr>
+      <w:r>
+        <w:pict w14:anchorId="155DE5F2">
+          <v:rect id="_x0000_i1027" style="width:0;height:1.5pt" o:hralign="center" o:hrstd="t" o:hr="t" fillcolor="#a0a0a0" stroked="f"/>
+        </w:pict>
+      </w:r>
+    </w:p>
+    <w:p>
+      <w:pPr>
+        <w:bidi w:val="0"/>
+        <w:rPr>
+          <w:b/>
+          <w:bCs/>
+        </w:rPr>
+      </w:pPr>
+      <w:r>
+        <w:rPr>
+          <w:b/>
+          <w:bCs/>
+        </w:rPr>
+        <w:t xml:space="preserve">What </w:t>
+      </w:r>
+      <w:proofErr w:type="gramStart"/>
+      <w:r>
+        <w:rPr>
+          <w:b/>
+          <w:bCs/>
+        </w:rPr>
+        <w:t>you</w:t>
+      </w:r>
+      <w:proofErr w:type="gramEnd"/>
+      <w:r>
+        <w:rPr>
+          <w:b/>
+          <w:bCs/>
+        </w:rPr>
+        <w:t xml:space="preserve"> </w:t>
+      </w:r>
+      <w:proofErr w:type="gramStart"/>
+      <w:r>
+        <w:rPr>
+          <w:b/>
+          <w:bCs/>
+        </w:rPr>
+        <w:t>actually do</w:t>
+      </w:r>
+      <w:proofErr w:type="gramEnd"/>
+      <w:r>
+        <w:rPr>
+          <w:b/>
+          <w:bCs/>
+        </w:rPr>
+        <w:t xml:space="preserve"> with it</w:t>
+      </w:r>
+    </w:p>
+    <w:p>
+      <w:pPr>
+        <w:bidi w:val="0"/>
+      </w:pPr>
+      <w:r>
+        <w:t>You paste in a list of protein names — say, 400 proteins secreted by mesenchymal stem cells — and the app runs eight parallel analyses automatically.</w:t>
+      </w:r>
+    </w:p>
+    <w:p>
+      <w:pPr>
+        <w:bidi w:val="0"/>
+      </w:pPr>
+      <w:r>
+        <w:rPr>
+          <w:b/>
+          <w:bCs/>
+        </w:rPr>
+        <w:t>What each analysis tells you:</w:t>
+      </w:r>
+    </w:p>
+    <w:p>
+      <w:pPr>
+        <w:bidi w:val="0"/>
+      </w:pPr>
+      <w:r>
+        <w:rPr>
+          <w:b/>
+          <w:bCs/>
+        </w:rPr>
+        <w:t>1. Per-protein annotation</w:t>
+      </w:r>
+      <w:r>
+        <w:t xml:space="preserve"> (</w:t>
+      </w:r>
+      <w:proofErr w:type="spellStart"/>
+      <w:r>
+        <w:t>UniProt</w:t>
+      </w:r>
+      <w:proofErr w:type="spellEnd"/>
+      <w:r>
+        <w:t>) For every protein in your list: what it does, where it's normally found in the body, what diseases it's linked to, what biological processes it participates in. Turns a gene name like "TGFB1" into a full biological profile.</w:t>
+      </w:r>
+    </w:p>
+    <w:p>
+      <w:pPr>
+        <w:bidi w:val="0"/>
+      </w:pPr>
+      <w:r>
+        <w:rPr>
+          <w:b/>
+          <w:bCs/>
+        </w:rPr>
+        <w:t>2. Secretion classification</w:t>
+      </w:r>
+      <w:r>
+        <w:t xml:space="preserve"> (local </w:t>
+      </w:r>
+      <w:proofErr w:type="spellStart"/>
+      <w:r>
+        <w:t>SignalP</w:t>
+      </w:r>
+      <w:proofErr w:type="spellEnd"/>
+      <w:r>
+        <w:t xml:space="preserve"> heuristic) Not all proteins in a </w:t>
+      </w:r>
+      <w:proofErr w:type="spellStart"/>
+      <w:r>
+        <w:t>secretome</w:t>
+      </w:r>
+      <w:proofErr w:type="spellEnd"/>
+      <w:r>
+        <w:t xml:space="preserve"> are truly </w:t>
+      </w:r>
+      <w:r>
+        <w:rPr>
+          <w:i/>
+          <w:iCs/>
+        </w:rPr>
+        <w:t>secreted</w:t>
+      </w:r>
+      <w:r>
+        <w:t xml:space="preserve"> — some leak out of dying cells, some are released in exosomes, some have classical signal peptides. This module classifies each protein by </w:t>
+      </w:r>
+      <w:r>
+        <w:rPr>
+          <w:i/>
+          <w:iCs/>
+        </w:rPr>
+        <w:t>how</w:t>
+      </w:r>
+      <w:r>
+        <w:t xml:space="preserve"> it gets out of the cell, which matters enormously for therapeutic dosing and targeting.</w:t>
+      </w:r>
+    </w:p>
+    <w:p>
+      <w:pPr>
+        <w:bidi w:val="0"/>
+      </w:pPr>
+      <w:r>
+        <w:rPr>
+          <w:b/>
+          <w:bCs/>
+        </w:rPr>
+        <w:lastRenderedPageBreak/>
+        <w:t>3. Functional clustering</w:t>
+      </w:r>
+      <w:r>
+        <w:t xml:space="preserve"> (STRING + </w:t>
+      </w:r>
+      <w:proofErr w:type="gramStart"/>
+      <w:r>
+        <w:t>g:Profiler</w:t>
+      </w:r>
+      <w:proofErr w:type="gramEnd"/>
+      <w:r>
+        <w:t xml:space="preserve">) Groups your 400 proteins into functional </w:t>
+      </w:r>
+      <w:proofErr w:type="gramStart"/>
+      <w:r>
+        <w:t>neighborhoods — "</w:t>
+      </w:r>
+      <w:proofErr w:type="gramEnd"/>
+      <w:r>
+        <w:t xml:space="preserve">these 47 proteins work together on inflammation," "these 23 are involved in angiogenesis," "these 31 regulate extracellular matrix remodeling." Shows you the network of interactions between your proteins visually. This answers: </w:t>
+      </w:r>
+      <w:r>
+        <w:rPr>
+          <w:i/>
+          <w:iCs/>
+        </w:rPr>
+        <w:t xml:space="preserve">what does this </w:t>
+      </w:r>
+      <w:proofErr w:type="spellStart"/>
+      <w:r>
+        <w:rPr>
+          <w:i/>
+          <w:iCs/>
+        </w:rPr>
+        <w:t>secretome</w:t>
+      </w:r>
+      <w:proofErr w:type="spellEnd"/>
+      <w:r>
+        <w:rPr>
+          <w:i/>
+          <w:iCs/>
+        </w:rPr>
+        <w:t xml:space="preserve"> collectively do?</w:t>
+      </w:r>
+    </w:p>
+    <w:p>
+      <w:pPr>
+        <w:bidi w:val="0"/>
+      </w:pPr>
+      <w:r>
+        <w:rPr>
+          <w:b/>
+          <w:bCs/>
+        </w:rPr>
+        <w:t>4. Cell and tissue origin</w:t>
+      </w:r>
+      <w:r>
+        <w:t xml:space="preserve"> (Human Protein Atlas) Cross-references your protein list against expression data from 80+ human tissue types and dozens of cell populations. Tells you: </w:t>
+      </w:r>
+      <w:r>
+        <w:rPr>
+          <w:i/>
+          <w:iCs/>
+        </w:rPr>
+        <w:t xml:space="preserve">which cell type is most likely producing this </w:t>
+      </w:r>
+      <w:proofErr w:type="spellStart"/>
+      <w:r>
+        <w:rPr>
+          <w:i/>
+          <w:iCs/>
+        </w:rPr>
+        <w:t>secretome</w:t>
+      </w:r>
+      <w:proofErr w:type="spellEnd"/>
+      <w:r>
+        <w:rPr>
+          <w:i/>
+          <w:iCs/>
+        </w:rPr>
+        <w:t>?</w:t>
+      </w:r>
+      <w:r>
+        <w:t xml:space="preserve"> Useful for validating that your experimental </w:t>
+      </w:r>
+      <w:proofErr w:type="spellStart"/>
+      <w:r>
+        <w:t>secretome</w:t>
+      </w:r>
+      <w:proofErr w:type="spellEnd"/>
+      <w:r>
+        <w:t xml:space="preserve"> matches the biology, and for identifying unexpected contaminating cell populations.</w:t>
+      </w:r>
+    </w:p>
+    <w:p>
+      <w:pPr>
+        <w:bidi w:val="0"/>
+      </w:pPr>
+      <w:r>
+        <w:rPr>
+          <w:b/>
+          <w:bCs/>
+        </w:rPr>
+        <w:t>5. Physiological concentration comparison</w:t>
+      </w:r>
+      <w:r>
+        <w:t xml:space="preserve"> (Human Protein Atlas Blood Atlas) Compares each of your proteins against measured concentrations in healthy human blood, plasma, and CSF — and in patients with various diseases. This is critical for therapeutic safety: if your </w:t>
+      </w:r>
+      <w:proofErr w:type="spellStart"/>
+      <w:r>
+        <w:t>secretome</w:t>
+      </w:r>
+      <w:proofErr w:type="spellEnd"/>
+      <w:r>
+        <w:t xml:space="preserve"> contains IL-6 at levels 100x higher than healthy plasma, that's a red flag for inflammatory toxicity.</w:t>
+      </w:r>
+    </w:p>
+    <w:p>
+      <w:pPr>
+        <w:bidi w:val="0"/>
+      </w:pPr>
+      <w:r>
+        <w:rPr>
+          <w:b/>
+          <w:bCs/>
+        </w:rPr>
+        <w:t>6. SASP flagging</w:t>
+      </w:r>
+      <w:r>
+        <w:t xml:space="preserve"> (local database) The Senescence-Associated Secretory Phenotype is a specific pattern of inflammatory proteins secreted by stressed or aging cells that </w:t>
+      </w:r>
+      <w:proofErr w:type="gramStart"/>
+      <w:r>
+        <w:t>is</w:t>
+      </w:r>
+      <w:proofErr w:type="gramEnd"/>
+      <w:r>
+        <w:t xml:space="preserve"> known to cause tissue damage and accelerate disease. If your </w:t>
+      </w:r>
+      <w:proofErr w:type="spellStart"/>
+      <w:r>
+        <w:t>secretome</w:t>
+      </w:r>
+      <w:proofErr w:type="spellEnd"/>
+      <w:r>
+        <w:t xml:space="preserve"> contains a significant fraction of SASP proteins, the app raises a warning — because injecting a SASP-rich </w:t>
+      </w:r>
+      <w:proofErr w:type="spellStart"/>
+      <w:r>
+        <w:t>secretome</w:t>
+      </w:r>
+      <w:proofErr w:type="spellEnd"/>
+      <w:r>
+        <w:t xml:space="preserve"> could do more harm than good regardless of its other beneficial components.</w:t>
+      </w:r>
+    </w:p>
+    <w:p>
+      <w:pPr>
+        <w:bidi w:val="0"/>
+      </w:pPr>
+      <w:r>
+        <w:rPr>
+          <w:b/>
+          <w:bCs/>
+        </w:rPr>
+        <w:t>7. Drug target identification</w:t>
+      </w:r>
+      <w:r>
+        <w:t xml:space="preserve"> (Pharos) Tells you which of your secreted proteins are already targeted by approved drugs or are in clinical development. This has two uses: it validates that your proteins are therapeutically relevant, and it flags potential drug interactions if a patient receiving your therapy is already on medication that targets one of your secreted proteins.</w:t>
+      </w:r>
+    </w:p>
+    <w:p>
+      <w:pPr>
+        <w:bidi w:val="0"/>
+      </w:pPr>
+      <w:r>
+        <w:rPr>
+          <w:b/>
+          <w:bCs/>
+        </w:rPr>
+        <w:t>8. Two-set statistical comparison</w:t>
+      </w:r>
+      <w:r>
+        <w:t xml:space="preserve"> If you have </w:t>
+      </w:r>
+      <w:proofErr w:type="spellStart"/>
+      <w:r>
+        <w:t>secretomes</w:t>
+      </w:r>
+      <w:proofErr w:type="spellEnd"/>
+      <w:r>
+        <w:t xml:space="preserve"> from two different conditions — for example, healthy MSCs vs. MSCs cultured under hypoxia — this module compares them statistically. Volcano plots showing which proteins are significantly up or down, pathway enrichment differences, PCA showing how different the two </w:t>
+      </w:r>
+      <w:proofErr w:type="spellStart"/>
+      <w:r>
+        <w:t>secretomes</w:t>
+      </w:r>
+      <w:proofErr w:type="spellEnd"/>
+      <w:r>
+        <w:t xml:space="preserve"> are overall. </w:t>
+      </w:r>
+      <w:proofErr w:type="gramStart"/>
+      <w:r>
+        <w:t>Answers</w:t>
+      </w:r>
+      <w:proofErr w:type="gramEnd"/>
+      <w:r>
+        <w:t xml:space="preserve">: </w:t>
+      </w:r>
+      <w:r>
+        <w:rPr>
+          <w:i/>
+          <w:iCs/>
+        </w:rPr>
+        <w:t>does my manufacturing condition change what the cells secrete in a therapeutically meaningful way?</w:t>
+      </w:r>
+    </w:p>
+    <w:p>
+      <w:pPr>
+        <w:bidi w:val="0"/>
+      </w:pPr>
+      <w:r>
+        <w:pict w14:anchorId="4E4B222C">
+          <v:rect id="_x0000_i1028" style="width:0;height:1.5pt" o:hralign="center" o:hrstd="t" o:hr="t" fillcolor="#a0a0a0" stroked="f"/>
+        </w:pict>
+      </w:r>
+    </w:p>
+    <w:p>
+      <w:pPr>
+        <w:bidi w:val="0"/>
+        <w:rPr>
+          <w:b/>
+          <w:bCs/>
+        </w:rPr>
+      </w:pPr>
+      <w:r>
+        <w:rPr>
+          <w:b/>
+          <w:bCs/>
+        </w:rPr>
+        <w:t>The output</w:t>
+      </w:r>
+    </w:p>
+    <w:p>
+      <w:pPr>
+        <w:bidi w:val="0"/>
+      </w:pPr>
+      <w:r>
+        <w:t>After running all eight modules on your protein list, you get a dashboard with five tabs:</w:t>
+      </w:r>
+    </w:p>
+    <w:p>
+      <w:pPr>
+        <w:bidi w:val="0"/>
+      </w:pPr>
+      <w:r>
+        <w:rPr>
+          <w:b/>
+          <w:bCs/>
+        </w:rPr>
+        <w:lastRenderedPageBreak/>
+        <w:t>Overview</w:t>
+      </w:r>
+      <w:r>
+        <w:t xml:space="preserve"> — summary cards showing secreted fraction, SASP risk score, drug targets found, top biological themes. A grid of every protein with badges showing secretion type, SASP membership, and drug targetability.</w:t>
+      </w:r>
+    </w:p>
+    <w:p>
+      <w:pPr>
+        <w:bidi w:val="0"/>
+      </w:pPr>
+      <w:r>
+        <w:rPr>
+          <w:b/>
+          <w:bCs/>
+        </w:rPr>
+        <w:t>Network</w:t>
+      </w:r>
+      <w:r>
+        <w:t xml:space="preserve"> — an interactive visual map of how your proteins connect to each other, colored by functional cluster, with a slider to filter by interaction confidence score.</w:t>
+      </w:r>
+    </w:p>
+    <w:p>
+      <w:pPr>
+        <w:bidi w:val="0"/>
+      </w:pPr>
+      <w:r>
+        <w:rPr>
+          <w:b/>
+          <w:bCs/>
+        </w:rPr>
+        <w:t>Functional clusters</w:t>
+      </w:r>
+      <w:r>
+        <w:t xml:space="preserve"> — bubble chart and ranked list of all enriched biological pathways, grouped by GO terms, KEGG pathways, and </w:t>
+      </w:r>
+      <w:proofErr w:type="spellStart"/>
+      <w:r>
+        <w:t>Reactome</w:t>
+      </w:r>
+      <w:proofErr w:type="spellEnd"/>
+      <w:r>
+        <w:t xml:space="preserve"> reactions.</w:t>
+      </w:r>
+    </w:p>
+    <w:p>
+      <w:pPr>
+        <w:bidi w:val="0"/>
+      </w:pPr>
+      <w:r>
+        <w:rPr>
+          <w:b/>
+          <w:bCs/>
+        </w:rPr>
+        <w:t>Concentration atlas</w:t>
+      </w:r>
+      <w:r>
+        <w:t xml:space="preserve"> — heatmap of your proteins across cell types and tissues, plus violin plots comparing expression in healthy vs. diseased states.</w:t>
+      </w:r>
+    </w:p>
+    <w:p>
+      <w:pPr>
+        <w:bidi w:val="0"/>
+      </w:pPr>
+      <w:r>
+        <w:rPr>
+          <w:b/>
+          <w:bCs/>
+        </w:rPr>
+        <w:t>Statistical comparison</w:t>
+      </w:r>
+      <w:r>
+        <w:t xml:space="preserve"> — only active when you submit two </w:t>
+      </w:r>
+      <w:proofErr w:type="spellStart"/>
+      <w:r>
+        <w:t>secretome</w:t>
+      </w:r>
+      <w:proofErr w:type="spellEnd"/>
+      <w:r>
+        <w:t xml:space="preserve"> sets. Volcano plot, Venn diagram of shared vs. unique proteins, PCA.</w:t>
+      </w:r>
+    </w:p>
+    <w:p>
+      <w:pPr>
+        <w:bidi w:val="0"/>
+      </w:pPr>
+      <w:r>
+        <w:pict w14:anchorId="336AC0BC">
+          <v:rect id="_x0000_i1029" style="width:0;height:1.5pt" o:hralign="center" o:hrstd="t" o:hr="t" fillcolor="#a0a0a0" stroked="f"/>
+        </w:pict>
+      </w:r>
+    </w:p>
+    <w:p>
+      <w:pPr>
+        <w:bidi w:val="0"/>
+        <w:rPr>
+          <w:b/>
+          <w:bCs/>
+        </w:rPr>
+      </w:pPr>
+      <w:r>
+        <w:rPr>
+          <w:b/>
+          <w:bCs/>
+        </w:rPr>
+        <w:t>Who it's for</w:t>
+      </w:r>
+    </w:p>
+    <w:p>
+      <w:pPr>
+        <w:bidi w:val="0"/>
+      </w:pPr>
+      <w:r>
+        <w:t>Researchers working on:</w:t>
+      </w:r>
+    </w:p>
+    <w:p>
+      <w:pPr>
+        <w:numPr>
+          <w:ilvl w:val="0"/>
+          <w:numId w:val="1"/>
+        </w:numPr>
+        <w:bidi w:val="0"/>
+      </w:pPr>
+      <w:r>
+        <w:t xml:space="preserve">Stem cell therapy (MSC </w:t>
+      </w:r>
+      <w:proofErr w:type="spellStart"/>
+      <w:r>
+        <w:t>secretome</w:t>
+      </w:r>
+      <w:proofErr w:type="spellEnd"/>
+      <w:r>
+        <w:t xml:space="preserve"> characterization)</w:t>
+      </w:r>
+    </w:p>
+    <w:p>
+      <w:pPr>
+        <w:numPr>
+          <w:ilvl w:val="0"/>
+          <w:numId w:val="1"/>
+        </w:numPr>
+        <w:bidi w:val="0"/>
+      </w:pPr>
+      <w:r>
+        <w:t>Conditioned medium / cell-free therapy development</w:t>
+      </w:r>
+    </w:p>
+    <w:p>
+      <w:pPr>
+        <w:numPr>
+          <w:ilvl w:val="0"/>
+          <w:numId w:val="1"/>
+        </w:numPr>
+        <w:bidi w:val="0"/>
+      </w:pPr>
+      <w:r>
+        <w:t>Extracellular vesicle / exosome therapy</w:t>
+      </w:r>
+    </w:p>
+    <w:p>
+      <w:pPr>
+        <w:numPr>
+          <w:ilvl w:val="0"/>
+          <w:numId w:val="1"/>
+        </w:numPr>
+        <w:bidi w:val="0"/>
+      </w:pPr>
+      <w:r>
+        <w:t xml:space="preserve">CAR-T and immune cell therapy </w:t>
+      </w:r>
+      <w:proofErr w:type="spellStart"/>
+      <w:r>
+        <w:t>secretome</w:t>
+      </w:r>
+      <w:proofErr w:type="spellEnd"/>
+      <w:r>
+        <w:t xml:space="preserve"> safety profiling</w:t>
+      </w:r>
+    </w:p>
+    <w:p>
+      <w:pPr>
+        <w:numPr>
+          <w:ilvl w:val="0"/>
+          <w:numId w:val="1"/>
+        </w:numPr>
+        <w:bidi w:val="0"/>
+      </w:pPr>
+      <w:r>
+        <w:t xml:space="preserve">Any experiment where understanding </w:t>
+      </w:r>
+      <w:r>
+        <w:rPr>
+          <w:i/>
+          <w:iCs/>
+        </w:rPr>
+        <w:t xml:space="preserve">what cells are </w:t>
+      </w:r>
+      <w:proofErr w:type="gramStart"/>
+      <w:r>
+        <w:rPr>
+          <w:i/>
+          <w:iCs/>
+        </w:rPr>
+        <w:t>secreting</w:t>
+      </w:r>
+      <w:proofErr w:type="gramEnd"/>
+      <w:r>
+        <w:t xml:space="preserve"> and </w:t>
+      </w:r>
+      <w:r>
+        <w:rPr>
+          <w:i/>
+          <w:iCs/>
+        </w:rPr>
+        <w:t>what that mixture will do therapeutically</w:t>
+      </w:r>
+      <w:r>
+        <w:t xml:space="preserve"> is the central question</w:t>
+      </w:r>
+    </w:p>
+    <w:p>
+      <w:pPr>
+        <w:bidi w:val="0"/>
+      </w:pPr>
+      <w:r>
+        <w:pict w14:anchorId="2170C277">
+          <v:rect id="_x0000_i1030" style="width:0;height:1.5pt" o:hralign="center" o:hrstd="t" o:hr="t" fillcolor="#a0a0a0" stroked="f"/>
+        </w:pict>
+      </w:r>
+    </w:p>
+    <w:p>
+      <w:pPr>
+        <w:bidi w:val="0"/>
+        <w:rPr>
+          <w:b/>
+          <w:bCs/>
+        </w:rPr>
+      </w:pPr>
+      <w:r>
+        <w:rPr>
+          <w:b/>
+          <w:bCs/>
+        </w:rPr>
+        <w:t>What makes it different from existing tools</w:t>
+      </w:r>
+    </w:p>
+    <w:p>
+      <w:pPr>
+        <w:bidi w:val="0"/>
+      </w:pPr>
+      <w:r>
+        <w:t xml:space="preserve">No existing tool does all of this in one place for a therapeutic interpretation context. STRING analyzes protein networks but doesn't compare to physiological concentrations. HPA has the concentration data but no network analysis. </w:t>
+      </w:r>
+      <w:proofErr w:type="gramStart"/>
+      <w:r>
+        <w:t>g:Profiler</w:t>
+      </w:r>
+      <w:proofErr w:type="gramEnd"/>
+      <w:r>
+        <w:t xml:space="preserve"> does pathway enrichment but has no </w:t>
+      </w:r>
+      <w:proofErr w:type="spellStart"/>
+      <w:r>
+        <w:t>secretome</w:t>
+      </w:r>
+      <w:proofErr w:type="spellEnd"/>
+      <w:r>
+        <w:t>-specific classification. SASP flagging doesn't exist as a standalone tool at all.</w:t>
+      </w:r>
+    </w:p>
+    <w:p>
+      <w:pPr>
+        <w:bidi w:val="0"/>
+      </w:pPr>
+      <w:proofErr w:type="spellStart"/>
+      <w:r>
+        <w:t>SecretomeProfiler</w:t>
+      </w:r>
+      <w:proofErr w:type="spellEnd"/>
+      <w:r>
+        <w:t xml:space="preserve"> connects all of these into a single workflow specifically designed around the question of </w:t>
+      </w:r>
+      <w:r>
+        <w:rPr>
+          <w:b/>
+          <w:bCs/>
+        </w:rPr>
+        <w:t>therapeutic benefit vs. risk</w:t>
+      </w:r>
+      <w:r>
+        <w:t xml:space="preserve"> of a cell </w:t>
+      </w:r>
+      <w:proofErr w:type="spellStart"/>
+      <w:r>
+        <w:t>secretome</w:t>
+      </w:r>
+      <w:proofErr w:type="spellEnd"/>
+      <w:r>
+        <w:t xml:space="preserve"> — which is the question that matters most as cell-based therapies move toward clinical translation.</w:t>
       </w:r>
     </w:p>
     <w:p>
@@ -7284,6 +8266,163 @@
     </w:sectPr>
   </w:body>
 </w:document>
+</file>
+
+<file path=word/numbering.xml><?xml version="1.0" encoding="utf-8"?>
+<w:numbering xmlns:wpc="http://schemas.microsoft.com/office/word/2010/wordprocessingCanvas" xmlns:cx="http://schemas.microsoft.com/office/drawing/2014/chartex" xmlns:cx1="http://schemas.microsoft.com/office/drawing/2015/9/8/chartex" xmlns:cx2="http://schemas.microsoft.com/office/drawing/2015/10/21/chartex" xmlns:cx3="http://schemas.microsoft.com/office/drawing/2016/5/9/chartex" xmlns:cx4="http://schemas.microsoft.com/office/drawing/2016/5/10/chartex" xmlns:cx5="http://schemas.microsoft.com/office/drawing/2016/5/11/chartex" xmlns:cx6="http://schemas.microsoft.com/office/drawing/2016/5/12/chartex" xmlns:cx7="http://schemas.microsoft.com/office/drawing/2016/5/13/chartex" xmlns:cx8="http://schemas.microsoft.com/office/drawing/2016/5/14/chartex" xmlns:mc="http://schemas.openxmlformats.org/markup-compatibility/2006" xmlns:aink="http://schemas.microsoft.com/office/drawing/2016/ink" xmlns:am3d="http://schemas.microsoft.com/office/drawing/2017/model3d" xmlns:o="urn:schemas-microsoft-com:office:office" xmlns:oel="http://schemas.microsoft.com/office/2019/extlst" xmlns:r="http://schemas.openxmlformats.org/officeDocument/2006/relationships" xmlns:m="http://schemas.openxmlformats.org/officeDocument/2006/math" xmlns:v="urn:schemas-microsoft-com:vml" xmlns:wp14="http://schemas.microsoft.com/office/word/2010/wordprocessingDrawing" xmlns:wp="http://schemas.openxmlformats.org/drawingml/2006/wordprocessingDrawing" xmlns:w10="urn:schemas-microsoft-com:office:word" xmlns:w="http://schemas.openxmlformats.org/wordprocessingml/2006/main" xmlns:w14="http://schemas.microsoft.com/office/word/2010/wordml" xmlns:w15="http://schemas.microsoft.com/office/word/2012/wordml" xmlns:w16cex="http://schemas.microsoft.com/office/word/2018/wordml/cex" xmlns:w16cid="http://schemas.microsoft.com/office/word/2016/wordml/cid" xmlns:w16="http://schemas.microsoft.com/office/word/2018/wordml" xmlns:w16du="http://schemas.microsoft.com/office/word/2023/wordml/word16du" xmlns:w16sdtdh="http://schemas.microsoft.com/office/word/2020/wordml/sdtdatahash" xmlns:w16sdtfl="http://schemas.microsoft.com/office/word/2024/wordml/sdtformatlock" xmlns:w16se="http://schemas.microsoft.com/office/word/2015/wordml/symex" xmlns:wpg="http://schemas.microsoft.com/office/word/2010/wordprocessingGroup" xmlns:wpi="http://schemas.microsoft.com/office/word/2010/wordprocessingInk" xmlns:wne="http://schemas.microsoft.com/office/word/2006/wordml" xmlns:wps="http://schemas.microsoft.com/office/word/2010/wordprocessingShape" mc:Ignorable="w14 w15 w16se w16cid w16 w16cex w16sdtdh w16sdtfl w16du wp14">
+  <w:abstractNum w:abstractNumId="0" w15:restartNumberingAfterBreak="0">
+    <w:nsid w:val="1DE22B02"/>
+    <w:multiLevelType w:val="multilevel"/>
+    <w:tmpl w:val="6EEA75B2"/>
+    <w:lvl w:ilvl="0">
+      <w:start w:val="1"/>
+      <w:numFmt w:val="bullet"/>
+      <w:lvlText w:val=""/>
+      <w:lvlJc w:val="left"/>
+      <w:pPr>
+        <w:tabs>
+          <w:tab w:val="num" w:pos="720"/>
+        </w:tabs>
+        <w:ind w:left="720" w:hanging="360"/>
+      </w:pPr>
+      <w:rPr>
+        <w:rFonts w:ascii="Symbol" w:hAnsi="Symbol" w:hint="default"/>
+        <w:sz w:val="20"/>
+      </w:rPr>
+    </w:lvl>
+    <w:lvl w:ilvl="1" w:tentative="1">
+      <w:start w:val="1"/>
+      <w:numFmt w:val="bullet"/>
+      <w:lvlText w:val="o"/>
+      <w:lvlJc w:val="left"/>
+      <w:pPr>
+        <w:tabs>
+          <w:tab w:val="num" w:pos="1440"/>
+        </w:tabs>
+        <w:ind w:left="1440" w:hanging="360"/>
+      </w:pPr>
+      <w:rPr>
+        <w:rFonts w:ascii="Courier New" w:hAnsi="Courier New" w:hint="default"/>
+        <w:sz w:val="20"/>
+      </w:rPr>
+    </w:lvl>
+    <w:lvl w:ilvl="2" w:tentative="1">
+      <w:start w:val="1"/>
+      <w:numFmt w:val="bullet"/>
+      <w:lvlText w:val=""/>
+      <w:lvlJc w:val="left"/>
+      <w:pPr>
+        <w:tabs>
+          <w:tab w:val="num" w:pos="2160"/>
+        </w:tabs>
+        <w:ind w:left="2160" w:hanging="360"/>
+      </w:pPr>
+      <w:rPr>
+        <w:rFonts w:ascii="Wingdings" w:hAnsi="Wingdings" w:hint="default"/>
+        <w:sz w:val="20"/>
+      </w:rPr>
+    </w:lvl>
+    <w:lvl w:ilvl="3" w:tentative="1">
+      <w:start w:val="1"/>
+      <w:numFmt w:val="bullet"/>
+      <w:lvlText w:val=""/>
+      <w:lvlJc w:val="left"/>
+      <w:pPr>
+        <w:tabs>
+          <w:tab w:val="num" w:pos="2880"/>
+        </w:tabs>
+        <w:ind w:left="2880" w:hanging="360"/>
+      </w:pPr>
+      <w:rPr>
+        <w:rFonts w:ascii="Wingdings" w:hAnsi="Wingdings" w:hint="default"/>
+        <w:sz w:val="20"/>
+      </w:rPr>
+    </w:lvl>
+    <w:lvl w:ilvl="4" w:tentative="1">
+      <w:start w:val="1"/>
+      <w:numFmt w:val="bullet"/>
+      <w:lvlText w:val=""/>
+      <w:lvlJc w:val="left"/>
+      <w:pPr>
+        <w:tabs>
+          <w:tab w:val="num" w:pos="3600"/>
+        </w:tabs>
+        <w:ind w:left="3600" w:hanging="360"/>
+      </w:pPr>
+      <w:rPr>
+        <w:rFonts w:ascii="Wingdings" w:hAnsi="Wingdings" w:hint="default"/>
+        <w:sz w:val="20"/>
+      </w:rPr>
+    </w:lvl>
+    <w:lvl w:ilvl="5" w:tentative="1">
+      <w:start w:val="1"/>
+      <w:numFmt w:val="bullet"/>
+      <w:lvlText w:val=""/>
+      <w:lvlJc w:val="left"/>
+      <w:pPr>
+        <w:tabs>
+          <w:tab w:val="num" w:pos="4320"/>
+        </w:tabs>
+        <w:ind w:left="4320" w:hanging="360"/>
+      </w:pPr>
+      <w:rPr>
+        <w:rFonts w:ascii="Wingdings" w:hAnsi="Wingdings" w:hint="default"/>
+        <w:sz w:val="20"/>
+      </w:rPr>
+    </w:lvl>
+    <w:lvl w:ilvl="6" w:tentative="1">
+      <w:start w:val="1"/>
+      <w:numFmt w:val="bullet"/>
+      <w:lvlText w:val=""/>
+      <w:lvlJc w:val="left"/>
+      <w:pPr>
+        <w:tabs>
+          <w:tab w:val="num" w:pos="5040"/>
+        </w:tabs>
+        <w:ind w:left="5040" w:hanging="360"/>
+      </w:pPr>
+      <w:rPr>
+        <w:rFonts w:ascii="Wingdings" w:hAnsi="Wingdings" w:hint="default"/>
+        <w:sz w:val="20"/>
+      </w:rPr>
+    </w:lvl>
+    <w:lvl w:ilvl="7" w:tentative="1">
+      <w:start w:val="1"/>
+      <w:numFmt w:val="bullet"/>
+      <w:lvlText w:val=""/>
+      <w:lvlJc w:val="left"/>
+      <w:pPr>
+        <w:tabs>
+          <w:tab w:val="num" w:pos="5760"/>
+        </w:tabs>
+        <w:ind w:left="5760" w:hanging="360"/>
+      </w:pPr>
+      <w:rPr>
+        <w:rFonts w:ascii="Wingdings" w:hAnsi="Wingdings" w:hint="default"/>
+        <w:sz w:val="20"/>
+      </w:rPr>
+    </w:lvl>
+    <w:lvl w:ilvl="8" w:tentative="1">
+      <w:start w:val="1"/>
+      <w:numFmt w:val="bullet"/>
+      <w:lvlText w:val=""/>
+      <w:lvlJc w:val="left"/>
+      <w:pPr>
+        <w:tabs>
+          <w:tab w:val="num" w:pos="6480"/>
+        </w:tabs>
+        <w:ind w:left="6480" w:hanging="360"/>
+      </w:pPr>
+      <w:rPr>
+        <w:rFonts w:ascii="Wingdings" w:hAnsi="Wingdings" w:hint="default"/>
+        <w:sz w:val="20"/>
+      </w:rPr>
+    </w:lvl>
+  </w:abstractNum>
+  <w:num w:numId="1" w16cid:durableId="1551964108">
+    <w:abstractNumId w:val="0"/>
+  </w:num>
+</w:numbering>
 </file>
 
 <file path=word/styles.xml><?xml version="1.0" encoding="utf-8"?>
@@ -8203,6 +9342,17 @@
       <w:spacing w:val="5"/>
     </w:rPr>
   </w:style>
+  <w:style w:type="paragraph" w:styleId="NormalWeb">
+    <w:name w:val="Normal (Web)"/>
+    <w:basedOn w:val="Normal"/>
+    <w:uiPriority w:val="99"/>
+    <w:semiHidden/>
+    <w:unhideWhenUsed/>
+    <w:rsid w:val="004229EC"/>
+    <w:rPr>
+      <w:rFonts w:ascii="Times New Roman" w:hAnsi="Times New Roman" w:cs="Times New Roman"/>
+    </w:rPr>
+  </w:style>
 </w:styles>
 </file>
 

</xml_diff>